<commit_message>
Add core transformer components and restructure modules
Introduced new modules for causal attention, multi-head attention, MLP, layer normalization, and decoder blocks in the Attention directory. Refactored MasterLLM to use decoder blocks and updated its dependencies. Moved and updated Jupyter notebooks, and added a new notebook for residual decoder connections. These changes lay the foundation for a transformer-based architecture.
</commit_message>
<xml_diff>
--- a/tanımlar.docx
+++ b/tanımlar.docx
@@ -20,10 +20,7 @@
     <w:p>
       <w:proofErr w:type="spellStart"/>
       <w:r>
-        <w:t>Unt</w:t>
-      </w:r>
-      <w:r>
-        <w:t>rainable</w:t>
+        <w:t>Untrainable</w:t>
       </w:r>
       <w:proofErr w:type="spellEnd"/>
       <w:r>
@@ -36,6 +33,59 @@
       <w:proofErr w:type="spellEnd"/>
     </w:p>
     <w:p/>
+    <w:p>
+      <w:r>
+        <w:t xml:space="preserve">Bert modellerde sonraki </w:t>
+      </w:r>
+      <w:proofErr w:type="spellStart"/>
+      <w:r>
+        <w:t>tokenı</w:t>
+      </w:r>
+      <w:proofErr w:type="spellEnd"/>
+      <w:r>
+        <w:t xml:space="preserve"> kapatmaya gerek </w:t>
+      </w:r>
+      <w:proofErr w:type="spellStart"/>
+      <w:r>
+        <w:t>yok.Ama</w:t>
+      </w:r>
+      <w:proofErr w:type="spellEnd"/>
+      <w:r>
+        <w:t xml:space="preserve"> </w:t>
+      </w:r>
+      <w:proofErr w:type="spellStart"/>
+      <w:r>
+        <w:t>llmlerde</w:t>
+      </w:r>
+      <w:proofErr w:type="spellEnd"/>
+      <w:r>
+        <w:t xml:space="preserve"> sonraki </w:t>
+      </w:r>
+      <w:proofErr w:type="spellStart"/>
+      <w:r>
+        <w:t>token</w:t>
+      </w:r>
+      <w:proofErr w:type="spellEnd"/>
+      <w:r>
+        <w:t xml:space="preserve"> tahmin edilir.</w:t>
+      </w:r>
+    </w:p>
+    <w:p/>
+    <w:p>
+      <w:r>
+        <w:t>Bağlamdan bilgi çıkarma.</w:t>
+      </w:r>
+    </w:p>
+    <w:p>
+      <w:proofErr w:type="spellStart"/>
+      <w:r>
+        <w:t>Örn:Ay,domateslerin</w:t>
+      </w:r>
+      <w:proofErr w:type="spellEnd"/>
+      <w:r>
+        <w:t xml:space="preserve"> olgunlaşması hangi ay veya gökyüzünde ay</w:t>
+      </w:r>
+    </w:p>
     <w:sectPr>
       <w:pgSz w:w="11906" w:h="16838"/>
       <w:pgMar w:top="1417" w:right="1417" w:bottom="1417" w:left="1417" w:header="708" w:footer="708" w:gutter="0"/>

</xml_diff>